<commit_message>
docs: README MTA YZ Merkezi GitHub yönetişim şablonuna uyarlandı
Eski README docs/README_ayrintili.md altına taşındı; .gitignore üretilen/büyük dosyalar için güncellendi; bekleyen kaynak/doküman değişiklikleri dahil.

Co-Authored-By: Claude Sonnet 5.5 <noreply@anthropic.com>
</commit_message>
<xml_diff>
--- a/experiments/terrain_transition/paper/out/full_paper_en.docx
+++ b/experiments/terrain_transition/paper/out/full_paper_en.docx
@@ -22,7 +22,7 @@
         <w:rPr>
           <w:sz w:val="24"/>
         </w:rPr>
-        <w:t>Haktan Yusuf Guloglu</w:t>
+        <w:t>Cem Ozkurt, Eyup Altug Tunc, Muhammed Emin Onay, Haktan Yusuf Guloglu</w:t>
       </w:r>
     </w:p>
     <w:p>
@@ -62,7 +62,7 @@
         <w:rPr>
           <w:sz w:val="24"/>
         </w:rPr>
-        <w:t>In procedurally generated multi-resolution terrain, the shape of the blending function joining a coarse global surface to a fine-detail local patch affects the quality of physically queryable contact geometry, yet this choice is usually a visual concern, not evaluated quantitatively for physics fidelity. This study compares the compact-support smoothstep blend used in a SAC-controlled, gimbal-thrust lunar lander in Isaac Lab against the infinite-support Gaussian blend inherited from a legacy codebase, under an equal transition-radius budget, and proposes a hybrid method using Gaussian blending near the landing-gear contact footprint and smoothstep beyond it. Across 30 seeds, analytic measurements show the as-shipped Gaussian produces roughly 3200 times worse boundary height continuity (C0, RMS) and 530 times worse slope continuity (C1) than smoothstep (Wilcoxon signed-rank, p &lt; 1e-8), a scale-invariant defect; a recalibrated Gaussian and the hybrid both restore near-machine-precision continuity, with negligible VRAM impact. Isaac Sim training runs (5.73 million steps per method) were first conducted with a single seed, where the calibrated Gaussian and hybrid appeared to reach a markedly higher final success rate than smoothstep. Extending the comparison to two more seeds (n=3 total) found no statistically significant difference between methods on any metric (all Mann-Whitney p &gt;= 0.20); the apparent gap is largely consistent with ordinary seed variance. This gives a concrete demonstration of how misleading single-seed RL comparisons can be: the blend function has a robust, measurable effect on boundary continuity, but this does not translate into a distinguishable RL training-performance difference at the present scale and n=3.</w:t>
+        <w:t>In procedurally generated multi-resolution terrain, the shape of the blending function joining a coarse global surface to a fine-detail local patch affects the quality of physically queryable contact geometry, yet this choice is usually treated as a visual concern rather than evaluated for physics fidelity. This study compares the compact-support smoothstep blend used in a SAC-controlled, gimbal-thrust lunar lander in Isaac Lab against the infinite-support Gaussian blend inherited from a legacy codebase, under an equal transition-radius budget, and proposes a hybrid method using Gaussian blending near the landing-gear contact footprint and smoothstep beyond it. Across 30 seeds, the as-shipped Gaussian produces roughly 3200 times worse boundary height continuity (C0, RMS) and 530 times worse slope continuity (C1) than smoothstep (Wilcoxon signed-rank, p &lt; 1e-8), a scale-invariant defect; a recalibrated Gaussian and the hybrid both restore near-machine-precision continuity with negligible VRAM impact. Isaac Sim training runs of 5.73 million steps per method, first conducted with a single seed, showed the calibrated Gaussian and hybrid reaching a markedly higher final success rate. Extending to three seeds per method found no statistically significant difference on any metric (all Mann-Whitney p &gt;= 0.20), the apparent gap being largely consistent with ordinary seed variance. The study thus demonstrates concretely how misleading single-seed reinforcement learning comparisons can be: the blend function has a robust, measurable effect on boundary continuity, but at this scale that effect does not reach training performance.</w:t>
       </w:r>
     </w:p>
     <w:p>
@@ -85,7 +85,7 @@
           <w:i/>
           <w:sz w:val="20"/>
         </w:rPr>
-        <w:t>Lunar landing simulation, Reinforcement learning, Isaac Lab, Procedural terrain generation, Multi-resolution blending, Continuity analysis, Soft Actor-Critic</w:t>
+        <w:t>Lunar landing simulation, Reinforcement learning, Isaac Lab, Procedural terrain generation, Multi-resolution blending, Continuity analysis</w:t>
       </w:r>
     </w:p>
     <w:p>
@@ -213,7 +213,7 @@
     <w:p>
       <w:pPr/>
       <w:r>
-        <w:t>Cluster 1 concerns multi-resolution blending and level-of-detail (LOD) transitions in procedural terrain. Geometry clipmaps (Losasso &amp; Hoppe, 2004), ROAM (Duchaineau et al., 1997), and geomipmapping (de Boer, 2000) form exactly the traditional computer-graphics lineage to which this study's two-mesh (global + local patch) framing belongs; all three treat the formation of cracks/seams at the boundary where a low- and a high-resolution mesh meet as a central engineering problem. This study's finding -- that the as-shipped Gaussian leaves a real seam when truncated at a finite radius -- is a concrete, measured instance of the same class of problem this literature has been trying to solve for more than twenty-five years; and smoothstep's compact support coincides with the principle, used by ROAM and geoclipmaps, of a weighting function that goes exactly to zero at the boundary.</w:t>
+        <w:t>Cluster 1 concerns multi-resolution blending and level-of-detail (LOD) transitions in procedural terrain. Geometry clipmaps (Losasso &amp; Hoppe, 2004), ROAM (Duchaineau et al., 1997), and geomipmapping (de Boer, 2000) form exactly the traditional computer-graphics lineage to which this study's two-mesh (global + local patch) framing belongs; all three treat the formation of cracks/seams at the boundary where a low- and a high-resolution mesh meet as a central engineering problem; Pajarola &amp; Gobbetti (2007) survey this family of semi-regular multiresolution models in full. The problem has not been retired by newer pipelines: Zhang et al. (2019) report that transitions between levels are still usually not handled well, producing popping artefacts, and address them with dynamic stitching strips, while Jain et al. (2024) attach a learning-based level-of-detailing stage to a quad-tree terrain renderer. What all of this work optimizes, however, is what the transition looks like, not what a physics query returns at it. This study's finding -- that the as-shipped Gaussian leaves a real seam when truncated at a finite radius -- is a concrete, measured instance of the same class of problem this literature has been trying to solve for more than twenty-five years; and smoothstep's compact support coincides with the principle, used by ROAM and geoclipmaps, of a weighting function that goes exactly to zero at the boundary.</w:t>
       </w:r>
     </w:p>
     <w:p>
@@ -225,19 +225,19 @@
     <w:p>
       <w:pPr/>
       <w:r>
-        <w:t>Cluster 3 concerns terrain modelling and contact dynamics in planetary/lunar landing simulations. The goal of the ALHAT program (Johnson &amp; Montgomery, 2008; NASA JPL, n.d.) -- precise landing within one hundred metres and LiDAR-based terrain-relative navigation -- and the accuracy level offered by LOLA/SELENE-based digital elevation models (Barker et al., 2016) show that in real lunar-landing engineering, terrain accuracy is not cosmetic but a direct operational requirement. This strengthens the study's "why seams/continuity matter" motivation: a discontinuity in the foot contact region corresponds, in real ALHAT-class systems, to a class of error that can affect hazard-detection and landing-site-selection decisions. This motivation is also corroborated by recent flight data: the vision-based navigation and obstacle-detection results of JAXA's SLIM mission (January 2024; Ishida et al., 2025) showed that real-time obstacle/terrain detection performed 50 m before landing yielded metre-level landing precision -- concretely demonstrating that errors in terrain representation are reflected directly in landing safety not only in simulation but in real flight.</w:t>
+        <w:t>Cluster 3 concerns terrain modelling and contact dynamics in planetary/lunar landing simulations. The goal of the ALHAT program (Johnson &amp; Montgomery, 2008; NASA JPL, n.d.) -- precise landing within one hundred metres and LiDAR-based terrain-relative navigation -- and the accuracy level offered by LOLA/SELENE-based digital elevation models (Barker et al., 2016) show that in real lunar-landing engineering, terrain accuracy is not cosmetic but a direct operational requirement. This strengthens the study's "why seams/continuity matter" motivation: a discontinuity in the foot contact region corresponds, in real ALHAT-class systems, to a class of error that can affect hazard-detection and landing-site-selection decisions. This motivation is also corroborated by recent flight data: the vision-based navigation and obstacle-detection results of JAXA's SLIM mission (January 2024; Ishida et al., 2025) showed that real-time obstacle/terrain detection performed 50 m before landing yielded metre-level landing precision -- concretely demonstrating that errors in terrain representation are reflected directly in landing safety not only in simulation but in real flight. The contact side carries the same sensitivity: using discrete-element analysis, Nakashima et al. (2010) show that the drawbar pull and sinkage of a small lunar rover wheel depend strongly on the local slope geometry it actually meets, which is precisely the quantity a seam perturbs. On the learning side, Scorsoglio et al. (2021) train image-based deep reinforcement meta-learning policies for autonomous lunar landing, but on rendered imagery rather than on a contact-resolved physics surface, so the geometry of the join never enters their evaluation.</w:t>
       </w:r>
     </w:p>
     <w:p>
       <w:pPr/>
       <w:r>
-        <w:t>Cluster 4 concerns procedural terrain randomization in physics-based RL environments. Rudin et al. (2022) use, on IsaacGym, a difficulty-based terrain curriculum similar to the terrain pool in this study; this shows that the study's curriculum and terrain-pool design is not an isolated instance but an established practice in the field. Mittal et al. (2023, Orbit) and NVIDIA (2025, Isaac Lab) define the architectural basis of the very platform this study uses, while Tobin et al. (2017) provide the general motivation for procedural randomization in sim-to-real transfer. None of these sources, however, treats the multi-resolution blending function itself (smoothstep, Gaussian, or hybrid) as a design variable within terrain randomization; all focus on terrain diversity, not on the effect of the blend shape on continuity and learning cost. This study is positioned precisely in that gap.</w:t>
+        <w:t>Cluster 4 concerns procedural terrain randomization in physics-based RL environments. Rudin et al. (2022) use, on IsaacGym, a difficulty-based terrain curriculum similar to the terrain pool in this study; this shows that the study's curriculum and terrain-pool design is not an isolated instance but an established practice in the field. Mittal et al. (2023, Orbit) and NVIDIA (2025, Isaac Lab) define the architectural basis of the very platform this study uses, while Tobin et al. (2017) provide the general motivation for procedural randomization in sim-to-real transfer. Muratore et al. (2022) survey robot learning from randomized simulations and catalogue the randomization axes used in practice, and Collins et al. (2021) compare the physics simulators these pipelines are built on, noting how seldom contact-level fidelity choices are reported quantitatively. Closest to this study's platform, Richard et al. (2024) present OmniLRS, an Isaac-Sim-based photorealistic lunar simulator assembled from a real DEM macro surface plus procedural fine detail -- the same two-layer construction used here -- but evaluate it for rover perception rather than for the contact geometry a lander's foot meets. None of these sources, however, treats the multi-resolution blending function itself (smoothstep, Gaussian, or hybrid) as a design variable within terrain randomization; all focus on terrain diversity, not on the effect of the blend shape on continuity and learning cost. This study is positioned precisely in that gap.</w:t>
       </w:r>
     </w:p>
     <w:p>
       <w:pPr/>
       <w:r>
-        <w:t>Cluster 5 concerns hybrid/regional combination of blending functions (partition of unity). Ohtake et al. (2003) are again the central source here: the multi-scale, partition-of-unity-style combination of compact-support basis functions is the general mathematical framework of this study's hybrid method (one function in the contact region, another beyond it, with a smooth switch between them). Under this framework, the hybrid switch not creating a new seam at machine precision is an expected result consistent with the literature: the convex combination of two C1-smooth functions with a C1-smooth weight is again C1-smooth.</w:t>
+        <w:t>Cluster 5 concerns hybrid/regional combination of blending functions (partition of unity). Ohtake et al. (2003) are again the central source here: the multi-scale, partition-of-unity-style combination of compact-support basis functions is the general mathematical framework of this study's hybrid method (one function in the contact region, another beyond it, with a smooth switch between them). The canonical statement of that framework is the multi-level partition of unity implicit (Ohtake, Belyaev, Alexa et al., 2003), in which locally fitted functions are blended by smooth, compactly supported weights that sum to one at every point -- exactly the role played here by the pair switch(r) and 1 - switch(r). Under this framework, the hybrid switch not creating a new seam at machine precision is an expected result consistent with the literature: the convex combination of two C1-smooth functions with a C1-smooth weight is again C1-smooth.</w:t>
       </w:r>
     </w:p>
     <w:p>
@@ -3923,7 +3923,7 @@
     <w:p>
       <w:pPr/>
       <w:r>
-        <w:t>This result does not confirm the finding, observed in the first (single-seed) measurement and discussed in detail in Section 5, that "the Gaussian and hybrid are significantly more successful than smoothstep." Going from n=1 to n=3, the effect size shrank (the Gaussian-smoothstep difference dropped from 11% to 4.7%) and the direction partly changed (the hybrid-smoothstep difference changed sign: in the first measurement the hybrid was higher than smoothstep, while in the three-seed average the hybrid is almost equal to smoothstep, even slightly lower). This pattern shows that the first finding is -- at least largely -- consistent with random run-to-run variance; this point is discussed in detail in Section 5.</w:t>
+        <w:t>This result does not confirm the finding, observed in the first (single-seed) measurement and discussed in detail in Section 5, that "the Gaussian and hybrid are significantly more successful than smoothstep." Going from n=1 to n=3, the effect size shrank (the Gaussian-smoothstep difference dropped from 11% to 4.7%) and the direction partly changed (the hybrid-smoothstep difference changed sign: in the first measurement the hybrid was higher than smoothstep, while in the three-seed average the hybrid is almost equal to smoothstep, even slightly lower). This pattern shows that the first finding is -- at least largely -- consistent with random run-to-run variance; this point is discussed in detail in Section 5. It is also the behaviour the reinforcement learning methodology literature predicts: Colas et al. (2018) show that the seed counts typically reported are far below the statistical power needed to resolve differences of this size, and Agarwal et al. (2021) demonstrate that point estimates computed from a handful of runs routinely reverse once uncertainty is reported properly.</w:t>
       </w:r>
     </w:p>
     <w:p>
@@ -3973,7 +3973,7 @@
     <w:p>
       <w:pPr/>
       <w:r>
-        <w:t>The most important limitation of this study is that it still has low statistical power with n=3: with the current data, the smallest p value the Mann-Whitney test can produce is already limited (around a minimum of p=0.10 in a 3-versus-3 comparison), so the "no significant difference" finding does not prove that the methods are genuinely equivalent -- it only shows that the large apparent difference in the first measurement could not be reliably confirmed. A second limitation is that the training scale (5.73 million steps, roughly 350 iterations) is below the full-scale configuration (1200 iterations) because of the compute budget; no run may have reached full convergence, which means the observed plateaus may reflect an interim performance difference rather than a final/asymptotic one. A third limitation is that the analytic/CPU study isolates only the fade formula itself and does not fully separate the source of the real training wall-clock difference (terrain generation, physics stepping, system variability) -- although the three-seed data shows this difference shrinking, it does not pin down its source with certainty.</w:t>
+        <w:t>The most important limitation of this study is that it still has low statistical power with n=3: with the current data, the smallest p value the Mann-Whitney test can produce is already limited (around a minimum of p=0.10 in a 3-versus-3 comparison), so the "no significant difference" finding does not prove that the methods are genuinely equivalent -- it only shows that the large apparent difference in the first measurement could not be reliably confirmed. Colas et al. (2019) make the remedy explicit: a comparison of this kind should either report interval estimates rather than point estimates, or state in advance the effect size it is powered to detect, and the present design does neither. A second limitation is that the training scale (5.73 million steps, roughly 350 iterations) is below the full-scale configuration (1200 iterations) because of the compute budget; no run may have reached full convergence, which means the observed plateaus may reflect an interim performance difference rather than a final/asymptotic one. A third limitation is that the analytic/CPU study isolates only the fade formula itself and does not fully separate the source of the real training wall-clock difference (terrain generation, physics stepping, system variability) -- although the three-seed data shows this difference shrinking, it does not pin down its source with certainty.</w:t>
       </w:r>
     </w:p>
     <w:p>
@@ -4019,7 +4019,7 @@
     <w:p>
       <w:pPr/>
       <w:r>
-        <w:t>This study was carried out without external funding or institutional support, using the author's own computational resources (a local NVIDIA GPU workstation). The author thanks the NVIDIA team for developing Isaac Lab and Isaac Sim as open source, and the open-source software libraries used in the experimental infrastructure (Stable-Baselines3, PyTorch, NumPy, SciPy, TensorBoard).</w:t>
+        <w:t>The authors thank the NVIDIA team for developing Isaac Lab and Isaac Sim as open source, and the maintainers of the open-source libraries used in the experimental infrastructure (Stable-Baselines3, PyTorch, NumPy, SciPy, and TensorBoard).</w:t>
       </w:r>
     </w:p>
     <w:p>
@@ -4027,13 +4027,13 @@
         <w:pStyle w:val="Heading1"/>
       </w:pPr>
       <w:r>
-        <w:t>Author Contributions (CRediT)</w:t>
+        <w:t>Funding</w:t>
       </w:r>
     </w:p>
     <w:p>
       <w:pPr/>
       <w:r>
-        <w:t>Haktan Yusuf Guloglu: Conceptualization, Methodology, Software, Validation, Formal analysis, Investigation, Resources, Data curation, Writing - Original Draft, Writing - Review and Editing, Visualization, Supervision, Project administration.</w:t>
+        <w:t>No funding was received for conducting this study. The experiments were run on the authors' own local NVIDIA GPU workstation.</w:t>
       </w:r>
     </w:p>
     <w:p>
@@ -4041,13 +4041,13 @@
         <w:pStyle w:val="Heading1"/>
       </w:pPr>
       <w:r>
-        <w:t>Conflict of Interest Statement</w:t>
+        <w:t>Competing interests</w:t>
       </w:r>
     </w:p>
     <w:p>
       <w:pPr/>
       <w:r>
-        <w:t>The author declares no known competing financial interests or personal relationships related to this work.</w:t>
+        <w:t>The authors declare no known competing financial interests or personal relationships related to this work.</w:t>
       </w:r>
     </w:p>
     <w:p>
@@ -4055,13 +4055,69 @@
         <w:pStyle w:val="Heading1"/>
       </w:pPr>
       <w:r>
-        <w:t>Data and Code Availability</w:t>
+        <w:t>Ethics approval and consent to participate</w:t>
       </w:r>
     </w:p>
     <w:p>
       <w:pPr/>
       <w:r>
-        <w:t>The analytic evaluation code used in this study (the NumPy port of the three blending functions, the continuity/cost metrics, the ablation scripts), the production environment code (the Isaac Lab task definition and the ISAACLAB_TERRAIN_BLEND_METHOD-selectable integration of the three methods), and the raw experimental outputs (the thirty-seed continuity measurements, the four ablation sweeps, the real training TensorBoard logs) are kept in the author's project repository and are available from the author on reasonable request. Moving the code to a public repository during the review process is planned.</w:t>
+        <w:t>Not applicable. This study is based entirely on numerical simulation and involved no human participants, no human data or tissue, and no animals.</w:t>
+      </w:r>
+    </w:p>
+    <w:p>
+      <w:pPr>
+        <w:pStyle w:val="Heading1"/>
+      </w:pPr>
+      <w:r>
+        <w:t>Consent for publication</w:t>
+      </w:r>
+    </w:p>
+    <w:p>
+      <w:pPr/>
+      <w:r>
+        <w:t>Not applicable. This study contains no data or images relating to any individual person.</w:t>
+      </w:r>
+    </w:p>
+    <w:p>
+      <w:pPr>
+        <w:pStyle w:val="Heading1"/>
+      </w:pPr>
+      <w:r>
+        <w:t>Data availability</w:t>
+      </w:r>
+    </w:p>
+    <w:p>
+      <w:pPr/>
+      <w:r>
+        <w:t>The raw experimental outputs that support the findings of this study -- the thirty-seed analytic continuity and cost measurements, the four ablation sweeps, and the TensorBoard logs of the nine real Isaac Sim training runs -- are kept in the authors' project repository and are available from the corresponding author on reasonable request. The authors intend to deposit these outputs in a public repository with a permanent identifier before final publication.</w:t>
+      </w:r>
+    </w:p>
+    <w:p>
+      <w:pPr>
+        <w:pStyle w:val="Heading1"/>
+      </w:pPr>
+      <w:r>
+        <w:t>Code availability</w:t>
+      </w:r>
+    </w:p>
+    <w:p>
+      <w:pPr/>
+      <w:r>
+        <w:t>The analytic evaluation code (the NumPy port of the three blending functions, the continuity and cost metrics, and the ablation scripts) and the production environment code (the Isaac Lab task definition together with the ISAACLAB_TERRAIN_BLEND_METHOD-selectable integration of the three methods) are kept in the authors' project repository and are available from the corresponding author on reasonable request. A public release is planned to accompany final publication.</w:t>
+      </w:r>
+    </w:p>
+    <w:p>
+      <w:pPr>
+        <w:pStyle w:val="Heading1"/>
+      </w:pPr>
+      <w:r>
+        <w:t>Author contributions</w:t>
+      </w:r>
+    </w:p>
+    <w:p>
+      <w:pPr/>
+      <w:r>
+        <w:t>Cem Ozkurt: Conceptualization, Methodology, Investigation, Writing - Original Draft, Project administration. Eyup Altug Tunc: Software, Validation, Investigation, Writing - Review and Editing. Muhammed Emin Onay: Data curation, Visualization, Investigation, Writing - Review and Editing. Haktan Yusuf Guloglu: Conceptualization, Software, Formal analysis, Resources, Writing - Original Draft, Writing - Review and Editing.</w:t>
       </w:r>
     </w:p>
     <w:p>
@@ -4070,6 +4126,14 @@
       </w:pPr>
       <w:r>
         <w:t>References</w:t>
+      </w:r>
+    </w:p>
+    <w:p>
+      <w:pPr>
+        <w:ind w:left="567" w:hanging="567"/>
+      </w:pPr>
+      <w:r>
+        <w:t>Agarwal, R., Schwarzer, M., Castro, P. S., Courville, A. C., &amp; Bellemare, M. G. (2021). Deep reinforcement learning at the edge of the statistical precipice. Advances in Neural Information Processing Systems (NeurIPS), 34. https://doi.org/10.48550/arXiv.2108.13264</w:t>
       </w:r>
     </w:p>
     <w:p>
@@ -4086,6 +4150,30 @@
       </w:pPr>
       <w:r>
         <w:t>de Boer, W. H. (2000). Fast terrain rendering using geometrical mipmapping (E-mersion Project technical report). https://www.flipcode.com/archives/article_geomipmaps.pdf</w:t>
+      </w:r>
+    </w:p>
+    <w:p>
+      <w:pPr>
+        <w:ind w:left="567" w:hanging="567"/>
+      </w:pPr>
+      <w:r>
+        <w:t>Colas, C., Sigaud, O., &amp; Oudeyer, P.-Y. (2018). How many random seeds? Statistical power analysis in deep reinforcement learning experiments. arXiv:1806.08295. https://doi.org/10.48550/arXiv.1806.08295</w:t>
+      </w:r>
+    </w:p>
+    <w:p>
+      <w:pPr>
+        <w:ind w:left="567" w:hanging="567"/>
+      </w:pPr>
+      <w:r>
+        <w:t>Colas, C., Sigaud, O., &amp; Oudeyer, P.-Y. (2019). A hitchhiker's guide to statistical comparisons of reinforcement learning algorithms. arXiv:1904.06979. https://doi.org/10.48550/arXiv.1904.06979</w:t>
+      </w:r>
+    </w:p>
+    <w:p>
+      <w:pPr>
+        <w:ind w:left="567" w:hanging="567"/>
+      </w:pPr>
+      <w:r>
+        <w:t>Collins, J., Chand, S., Vanderkop, A., &amp; Howard, D. (2021). A review of physics simulators for robotic applications. IEEE Access, 9, 51416-51431. https://doi.org/10.1109/ACCESS.2021.3068769</w:t>
       </w:r>
     </w:p>
     <w:p>
@@ -4141,6 +4229,14 @@
         <w:ind w:left="567" w:hanging="567"/>
       </w:pPr>
       <w:r>
+        <w:t>Jain, A., Sharma, A. K., &amp; Rajan, K. S. (2024). Learning based infinite terrain generation with level of detailing. 2024 International Conference on 3D Vision (3DV), 1048-1058. https://doi.org/10.1109/3DV62453.2024.00077</w:t>
+      </w:r>
+    </w:p>
+    <w:p>
+      <w:pPr>
+        <w:ind w:left="567" w:hanging="567"/>
+      </w:pPr>
+      <w:r>
         <w:t>Johnson, A. E., &amp; Montgomery, J. F. (2008). Overview of terrain relative navigation approaches for precise lunar landing. 2008 IEEE Aerospace Conference, 1-10. https://doi.org/10.1109/AERO.2008.4526302</w:t>
       </w:r>
     </w:p>
@@ -4158,6 +4254,22 @@
       </w:pPr>
       <w:r>
         <w:t>Mittal, M., Yu, C., Yu, Q., Liu, J., Rudin, N., Hoeller, D., Yuan, J. L., Singh, R., Guo, Y., Mazhar, H., Mandlekar, A., Babich, B., State, G., Hutter, M., &amp; Garg, A. (2023). Orbit: A unified simulation framework for interactive robot learning environments. IEEE Robotics and Automation Letters, 8(6), 3740-3747. https://doi.org/10.1109/LRA.2023.3270034</w:t>
+      </w:r>
+    </w:p>
+    <w:p>
+      <w:pPr>
+        <w:ind w:left="567" w:hanging="567"/>
+      </w:pPr>
+      <w:r>
+        <w:t>Muratore, F., Ramos, F., Turk, G., Yu, W., Gienger, M., &amp; Peters, J. (2022). Robot learning from randomized simulations: A review. Frontiers in Robotics and AI, 9, 799893. https://doi.org/10.3389/frobt.2022.799893</w:t>
+      </w:r>
+    </w:p>
+    <w:p>
+      <w:pPr>
+        <w:ind w:left="567" w:hanging="567"/>
+      </w:pPr>
+      <w:r>
+        <w:t>Nakashima, H., Fujii, H., Oida, A., Momozu, M., Kanamori, H., Aoki, S., Yokoyama, T., Shimizu, H., Miyasaka, J., &amp; Ohdoi, K. (2010). Discrete element method analysis of single wheel performance for a small lunar rover on sloped terrain. Journal of Terramechanics, 47(5), 307-321. https://doi.org/10.1016/j.jterra.2010.04.001</w:t>
       </w:r>
     </w:p>
     <w:p>
@@ -4189,6 +4301,22 @@
         <w:ind w:left="567" w:hanging="567"/>
       </w:pPr>
       <w:r>
+        <w:t>Ohtake, Y., Belyaev, A., Alexa, M., Turk, G., &amp; Seidel, H.-P. (2003). Multi-level partition of unity implicits. ACM Transactions on Graphics, 22(3), 463-470. https://doi.org/10.1145/882262.882293</w:t>
+      </w:r>
+    </w:p>
+    <w:p>
+      <w:pPr>
+        <w:ind w:left="567" w:hanging="567"/>
+      </w:pPr>
+      <w:r>
+        <w:t>Pajarola, R., &amp; Gobbetti, E. (2007). Survey of semi-regular multiresolution models for interactive terrain rendering. The Visual Computer, 23(8), 583-605. https://doi.org/10.1007/s00371-007-0163-2</w:t>
+      </w:r>
+    </w:p>
+    <w:p>
+      <w:pPr>
+        <w:ind w:left="567" w:hanging="567"/>
+      </w:pPr>
+      <w:r>
         <w:t>Raffin, A., Hill, A., Gleave, A., Kanervisto, A., Ernestus, M., &amp; Dormann, N. (2021). Stable-Baselines3: Reliable reinforcement learning implementations. Journal of Machine Learning Research, 22(268), 1-8. http://jmlr.org/papers/v22/20-1364.html</w:t>
       </w:r>
     </w:p>
@@ -4197,7 +4325,23 @@
         <w:ind w:left="567" w:hanging="567"/>
       </w:pPr>
       <w:r>
+        <w:t>Richard, A., Kamohara, J., Uno, K., Santra, S., van der Meer, D., Olivares-Mendez, M., &amp; Yoshida, K. (2024). OmniLRS: A photorealistic simulator for lunar robotics. 2024 IEEE International Conference on Robotics and Automation (ICRA), 16901-16907. https://doi.org/10.1109/ICRA57147.2024.10610026</w:t>
+      </w:r>
+    </w:p>
+    <w:p>
+      <w:pPr>
+        <w:ind w:left="567" w:hanging="567"/>
+      </w:pPr>
+      <w:r>
         <w:t>Rudin, N., Hoeller, D., Reist, P., &amp; Hutter, M. (2022). Learning to walk in minutes using massively parallel deep reinforcement learning. Proceedings of the 5th Conference on Robot Learning (CoRL 2022), PMLR 164, 91-100. https://proceedings.mlr.press/v164/rudin22a.html</w:t>
+      </w:r>
+    </w:p>
+    <w:p>
+      <w:pPr>
+        <w:ind w:left="567" w:hanging="567"/>
+      </w:pPr>
+      <w:r>
+        <w:t>Scorsoglio, A., D'Ambrosio, A., Ghilardi, L., Gaudet, B., Curti, F., &amp; Furfaro, R. (2021). Image-based deep reinforcement meta-learning for autonomous lunar landing. Journal of Spacecraft and Rockets, 59(1), 153-165. https://doi.org/10.2514/1.A35072</w:t>
       </w:r>
     </w:p>
     <w:p>
@@ -4214,6 +4358,14 @@
       </w:pPr>
       <w:r>
         <w:t>Wendland, H. (1995). Piecewise polynomial, positive definite and compactly supported radial basis functions of minimal degree. Advances in Computational Mathematics, 4(1), 389-396. https://doi.org/10.1007/BF02123482</w:t>
+      </w:r>
+    </w:p>
+    <w:p>
+      <w:pPr>
+        <w:ind w:left="567" w:hanging="567"/>
+      </w:pPr>
+      <w:r>
+        <w:t>Zhang, L., She, J., Tan, J., Wang, B., &amp; Sun, Y. (2019). A multilevel terrain rendering method based on dynamic stitching strips. ISPRS International Journal of Geo-Information, 8(6), 255. https://doi.org/10.3390/ijgi8060255</w:t>
       </w:r>
     </w:p>
     <w:sectPr>

</xml_diff>